<commit_message>
upd edicola votiva word
</commit_message>
<xml_diff>
--- a/DOCS_DA_CONVERTIRE/edicola_votiva_en.docx
+++ b/DOCS_DA_CONVERTIRE/edicola_votiva_en.docx
@@ -6,8 +6,13 @@
       <w:r>
         <w:t xml:space="preserve">Votive shrine in Via Tanari Vecchia, at the corner of Via </w:t>
       </w:r>
-      <w:r>
-        <w:t xml:space="preserve">Avesella . </w:t>
+      <w:proofErr w:type="spellStart"/>
+      <w:r>
+        <w:t>Avesella</w:t>
+      </w:r>
+      <w:proofErr w:type="spellEnd"/>
+      <w:r>
+        <w:t xml:space="preserve"> . </w:t>
       </w:r>
       <w:r>
         <w:br/>
@@ -33,7 +38,23 @@
           <w:b/>
           <w:bCs/>
         </w:rPr>
-        <w:t xml:space="preserve">Via Avesella </w:t>
+        <w:t xml:space="preserve">Via </w:t>
+      </w:r>
+      <w:proofErr w:type="spellStart"/>
+      <w:r>
+        <w:rPr>
+          <w:b/>
+          <w:bCs/>
+        </w:rPr>
+        <w:t>Avesella</w:t>
+      </w:r>
+      <w:proofErr w:type="spellEnd"/>
+      <w:r>
+        <w:rPr>
+          <w:b/>
+          <w:bCs/>
+        </w:rPr>
+        <w:t xml:space="preserve"> </w:t>
       </w:r>
       <w:r>
         <w:t xml:space="preserve">, depicts the </w:t>
@@ -58,10 +79,10 @@
           <w:noProof/>
         </w:rPr>
         <w:drawing>
-          <wp:inline distT="0" distB="0" distL="0" distR="0" wp14:anchorId="3257DF04" wp14:editId="70137218">
-            <wp:extent cx="1475232" cy="1993392"/>
-            <wp:effectExtent l="0" t="0" r="0" b="6985"/>
-            <wp:docPr id="1624613296" name="Immagine 4"/>
+          <wp:inline distT="0" distB="0" distL="0" distR="0" wp14:anchorId="36E93217" wp14:editId="4D77D0A8">
+            <wp:extent cx="2550017" cy="3665220"/>
+            <wp:effectExtent l="0" t="0" r="3175" b="0"/>
+            <wp:docPr id="674664998" name="Immagine 1"/>
             <wp:cNvGraphicFramePr>
               <a:graphicFrameLocks xmlns:a="http://schemas.openxmlformats.org/drawingml/2006/main" noChangeAspect="1"/>
             </wp:cNvGraphicFramePr>
@@ -69,7 +90,7 @@
               <a:graphicData uri="http://schemas.openxmlformats.org/drawingml/2006/picture">
                 <pic:pic xmlns:pic="http://schemas.openxmlformats.org/drawingml/2006/picture">
                   <pic:nvPicPr>
-                    <pic:cNvPr id="1624613296" name="Immagine 1624613296"/>
+                    <pic:cNvPr id="674664998" name="Immagine 674664998"/>
                     <pic:cNvPicPr/>
                   </pic:nvPicPr>
                   <pic:blipFill>
@@ -87,7 +108,7 @@
                   <pic:spPr>
                     <a:xfrm>
                       <a:off x="0" y="0"/>
-                      <a:ext cx="1475232" cy="1993392"/>
+                      <a:ext cx="2574189" cy="3699963"/>
                     </a:xfrm>
                     <a:prstGeom prst="rect">
                       <a:avLst/>
@@ -105,7 +126,18 @@
         <w:jc w:val="center"/>
       </w:pPr>
       <w:r>
-        <w:t>[SPLIT_BLOCK:angolo_tanari_avesella.jpg]</w:t>
+        <w:t>[</w:t>
+      </w:r>
+      <w:proofErr w:type="spellStart"/>
+      <w:r>
+        <w:t>SPLIT_BLOCK:</w:t>
+      </w:r>
+      <w:r>
+        <w:t>edicola_madonna_con_bambino.jpg</w:t>
+      </w:r>
+      <w:proofErr w:type="spellEnd"/>
+      <w:r>
+        <w:t>]</w:t>
       </w:r>
     </w:p>
     <w:p>
@@ -196,7 +228,23 @@
           <w:b/>
           <w:bCs/>
         </w:rPr>
-        <w:t xml:space="preserve">Via Tanari Vecchia and Via Avesella </w:t>
+        <w:t xml:space="preserve">Via Tanari Vecchia and Via </w:t>
+      </w:r>
+      <w:proofErr w:type="spellStart"/>
+      <w:r>
+        <w:rPr>
+          <w:b/>
+          <w:bCs/>
+        </w:rPr>
+        <w:t>Avesella</w:t>
+      </w:r>
+      <w:proofErr w:type="spellEnd"/>
+      <w:r>
+        <w:rPr>
+          <w:b/>
+          <w:bCs/>
+        </w:rPr>
+        <w:t xml:space="preserve"> </w:t>
       </w:r>
       <w:r>
         <w:t>.</w:t>
@@ -204,6 +252,7 @@
     </w:p>
     <w:p>
       <w:r>
+        <w:lastRenderedPageBreak/>
         <w:t>Here are the details that confirm the identification and some more information about what we see in the photo:</w:t>
       </w:r>
     </w:p>
@@ -232,7 +281,15 @@
         <w:t xml:space="preserve">Madonna and Child </w:t>
       </w:r>
       <w:r>
-        <w:t>, framed by a colourful garland of flowers and fruit.</w:t>
+        <w:t xml:space="preserve">, framed by a </w:t>
+      </w:r>
+      <w:proofErr w:type="spellStart"/>
+      <w:r>
+        <w:t>colourful</w:t>
+      </w:r>
+      <w:proofErr w:type="spellEnd"/>
+      <w:r>
+        <w:t xml:space="preserve"> garland of flowers and fruit.</w:t>
       </w:r>
     </w:p>
     <w:p>
@@ -260,11 +317,7 @@
         <w:t xml:space="preserve">"COMPAGNIA DELL'AVESELLA </w:t>
       </w:r>
       <w:r>
-        <w:t xml:space="preserve">." This confirms the building's </w:t>
-      </w:r>
-      <w:r>
-        <w:lastRenderedPageBreak/>
-        <w:t>ancient connection with the historic brotherhood of the same name, which managed the nearby Hospital and Oratory of Santa Maria della Pioggia.</w:t>
+        <w:t>." This confirms the building's ancient connection with the historic brotherhood of the same name, which managed the nearby Hospital and Oratory of Santa Maria della Pioggia.</w:t>
       </w:r>
     </w:p>
     <w:p>
@@ -304,12 +357,100 @@
       </w:r>
     </w:p>
     <w:p>
+      <w:pPr>
+        <w:ind w:left="360"/>
+        <w:jc w:val="center"/>
+        <w:rPr>
+          <w:noProof/>
+        </w:rPr>
+      </w:pPr>
+    </w:p>
+    <w:p>
+      <w:pPr>
+        <w:ind w:left="360"/>
+        <w:jc w:val="center"/>
+      </w:pPr>
+      <w:r>
+        <w:rPr>
+          <w:noProof/>
+        </w:rPr>
+        <w:drawing>
+          <wp:inline distT="0" distB="0" distL="0" distR="0" wp14:anchorId="72563F97" wp14:editId="64C34462">
+            <wp:extent cx="2400300" cy="2858294"/>
+            <wp:effectExtent l="0" t="0" r="0" b="0"/>
+            <wp:docPr id="1631022248" name="Immagine 2"/>
+            <wp:cNvGraphicFramePr>
+              <a:graphicFrameLocks xmlns:a="http://schemas.openxmlformats.org/drawingml/2006/main" noChangeAspect="1"/>
+            </wp:cNvGraphicFramePr>
+            <a:graphic xmlns:a="http://schemas.openxmlformats.org/drawingml/2006/main">
+              <a:graphicData uri="http://schemas.openxmlformats.org/drawingml/2006/picture">
+                <pic:pic xmlns:pic="http://schemas.openxmlformats.org/drawingml/2006/picture">
+                  <pic:nvPicPr>
+                    <pic:cNvPr id="1631022248" name="Immagine 1631022248"/>
+                    <pic:cNvPicPr/>
+                  </pic:nvPicPr>
+                  <pic:blipFill>
+                    <a:blip r:embed="rId6" cstate="print">
+                      <a:extLst>
+                        <a:ext uri="{28A0092B-C50C-407E-A947-70E740481C1C}">
+                          <a14:useLocalDpi xmlns:a14="http://schemas.microsoft.com/office/drawing/2010/main" val="0"/>
+                        </a:ext>
+                      </a:extLst>
+                    </a:blip>
+                    <a:stretch>
+                      <a:fillRect/>
+                    </a:stretch>
+                  </pic:blipFill>
+                  <pic:spPr>
+                    <a:xfrm>
+                      <a:off x="0" y="0"/>
+                      <a:ext cx="2426534" cy="2889534"/>
+                    </a:xfrm>
+                    <a:prstGeom prst="rect">
+                      <a:avLst/>
+                    </a:prstGeom>
+                  </pic:spPr>
+                </pic:pic>
+              </a:graphicData>
+            </a:graphic>
+          </wp:inline>
+        </w:drawing>
+      </w:r>
+    </w:p>
+    <w:p>
+      <w:pPr>
+        <w:ind w:left="360"/>
+        <w:jc w:val="center"/>
+      </w:pPr>
+      <w:r>
+        <w:t>[</w:t>
+      </w:r>
+      <w:proofErr w:type="spellStart"/>
+      <w:r>
+        <w:t>SPLIT_BLOCK:</w:t>
+      </w:r>
+      <w:r>
+        <w:t>angolo_edicola_nicchia_vuota.jpg</w:t>
+      </w:r>
+      <w:proofErr w:type="spellEnd"/>
+      <w:r>
+        <w:t>]</w:t>
+      </w:r>
+    </w:p>
+    <w:p>
+      <w:pPr>
+        <w:ind w:left="360"/>
+      </w:pPr>
+    </w:p>
+    <w:p/>
+    <w:p>
       <w:r>
         <w:t>It's a classic example of how Bologna's history remains embedded in its walls, even in alleys off the beaten track.</w:t>
       </w:r>
     </w:p>
     <w:p>
       <w:r>
+        <w:lastRenderedPageBreak/>
         <w:t xml:space="preserve">The building housing the newsstand in the photo is a veritable palimpsest of Bolognese history. Here are some interesting facts about the </w:t>
       </w:r>
       <w:r>
@@ -317,7 +458,23 @@
           <w:b/>
           <w:bCs/>
         </w:rPr>
-        <w:t xml:space="preserve">Compagnia dell'Avesella and </w:t>
+        <w:t xml:space="preserve">Compagnia </w:t>
+      </w:r>
+      <w:proofErr w:type="spellStart"/>
+      <w:r>
+        <w:rPr>
+          <w:b/>
+          <w:bCs/>
+        </w:rPr>
+        <w:t>dell'Avesella</w:t>
+      </w:r>
+      <w:proofErr w:type="spellEnd"/>
+      <w:r>
+        <w:rPr>
+          <w:b/>
+          <w:bCs/>
+        </w:rPr>
+        <w:t xml:space="preserve"> and </w:t>
       </w:r>
       <w:r>
         <w:t>the context of that wall:</w:t>
@@ -330,27 +487,53 @@
           <w:bCs/>
         </w:rPr>
       </w:pPr>
-      <w:r>
-        <w:rPr>
-          <w:b/>
-          <w:bCs/>
-        </w:rPr>
-        <w:t>Avesella Company</w:t>
+      <w:proofErr w:type="spellStart"/>
+      <w:r>
+        <w:rPr>
+          <w:b/>
+          <w:bCs/>
+        </w:rPr>
+        <w:t>Avesella</w:t>
+      </w:r>
+      <w:proofErr w:type="spellEnd"/>
+      <w:r>
+        <w:rPr>
+          <w:b/>
+          <w:bCs/>
+        </w:rPr>
+        <w:t xml:space="preserve"> Company</w:t>
       </w:r>
     </w:p>
     <w:p>
       <w:r>
         <w:t xml:space="preserve">This brotherhood was one of the most active in the neighborhood. Its name derives from the </w:t>
       </w:r>
-      <w:r>
-        <w:rPr>
-          <w:b/>
-          <w:bCs/>
-        </w:rPr>
-        <w:t xml:space="preserve">Avesa stream </w:t>
-      </w:r>
-      <w:r>
-        <w:t>(or Avesella canal ), which once flowed openly through this very area.</w:t>
+      <w:proofErr w:type="spellStart"/>
+      <w:r>
+        <w:rPr>
+          <w:b/>
+          <w:bCs/>
+        </w:rPr>
+        <w:t>Avesa</w:t>
+      </w:r>
+      <w:proofErr w:type="spellEnd"/>
+      <w:r>
+        <w:rPr>
+          <w:b/>
+          <w:bCs/>
+        </w:rPr>
+        <w:t xml:space="preserve"> stream </w:t>
+      </w:r>
+      <w:r>
+        <w:t xml:space="preserve">(or </w:t>
+      </w:r>
+      <w:proofErr w:type="spellStart"/>
+      <w:r>
+        <w:t>Avesella</w:t>
+      </w:r>
+      <w:proofErr w:type="spellEnd"/>
+      <w:r>
+        <w:t xml:space="preserve"> canal ), which once flowed openly through this very area.</w:t>
       </w:r>
     </w:p>
     <w:p>
@@ -406,7 +589,15 @@
     </w:p>
     <w:p>
       <w:r>
-        <w:t>Today, Via Avesella appears to be a dry alley, but water still flows beneath the pavement. In the past, life in this area was driven by mills and washerwomen who used the canal. The votive shrine also served as a source of comfort and protection for those who worked in an area that was at the time very humid and subject to frequent flooding.</w:t>
+        <w:t xml:space="preserve">Today, Via </w:t>
+      </w:r>
+      <w:proofErr w:type="spellStart"/>
+      <w:r>
+        <w:t>Avesella</w:t>
+      </w:r>
+      <w:proofErr w:type="spellEnd"/>
+      <w:r>
+        <w:t xml:space="preserve"> appears to be a dry alley, but water still flows beneath the pavement. In the past, life in this area was driven by mills and washerwomen who used the canal. The votive shrine also served as a source of comfort and protection for those who worked in an area that was at the time very humid and subject to frequent flooding.</w:t>
       </w:r>
     </w:p>
     <w:p>
@@ -426,7 +617,15 @@
     </w:p>
     <w:p>
       <w:r>
-        <w:t>After the religious congregations were dissolved by Napoleon, the interior spaces became sculpture workshops. The area between Via Tanari and Via Avesella was for decades the beating heart of 19th-century Bolognese sculpture. Even today, if you look beyond the doorways in that area, you can glimpse courtyards that retain the charm of old art workshops.</w:t>
+        <w:t xml:space="preserve">After the religious congregations were dissolved by Napoleon, the interior spaces became sculpture workshops. The area between Via Tanari and Via </w:t>
+      </w:r>
+      <w:proofErr w:type="spellStart"/>
+      <w:r>
+        <w:t>Avesella</w:t>
+      </w:r>
+      <w:proofErr w:type="spellEnd"/>
+      <w:r>
+        <w:t xml:space="preserve"> was for decades the beating heart of 19th-century Bolognese sculpture. Even today, if you look beyond the doorways in that area, you can glimpse courtyards that retain the charm of old art workshops.</w:t>
       </w:r>
     </w:p>
     <w:p>
@@ -446,58 +645,114 @@
     </w:p>
     <w:p>
       <w:r>
+        <w:t xml:space="preserve">The small empty niche on the corner seen in the photo is particularly interesting: these cavities often housed very simple terracotta statuettes, known as "Earthquake </w:t>
+      </w:r>
+      <w:proofErr w:type="spellStart"/>
+      <w:r>
+        <w:t>Madonnas</w:t>
+      </w:r>
+      <w:proofErr w:type="spellEnd"/>
+      <w:r>
+        <w:t xml:space="preserve">" or protectors of </w:t>
+      </w:r>
+      <w:proofErr w:type="spellStart"/>
+      <w:r>
+        <w:t>travellers</w:t>
+      </w:r>
+      <w:proofErr w:type="spellEnd"/>
+      <w:r>
+        <w:t>, which were removed or lost over time.</w:t>
+      </w:r>
+    </w:p>
+    <w:p>
+      <w:pPr>
+        <w:rPr>
+          <w:b/>
+          <w:bCs/>
+        </w:rPr>
+      </w:pPr>
+      <w:r>
+        <w:rPr>
+          <w:b/>
+          <w:bCs/>
+        </w:rPr>
+        <w:t xml:space="preserve">In </w:t>
+      </w:r>
+      <w:proofErr w:type="spellStart"/>
+      <w:r>
+        <w:rPr>
+          <w:b/>
+          <w:bCs/>
+        </w:rPr>
+        <w:t>Avesella</w:t>
+      </w:r>
+      <w:proofErr w:type="spellEnd"/>
+      <w:r>
+        <w:rPr>
+          <w:b/>
+          <w:bCs/>
+        </w:rPr>
+        <w:t xml:space="preserve"> there is another votive shrine</w:t>
+      </w:r>
+    </w:p>
+    <w:p>
+      <w:r>
+        <w:t xml:space="preserve">In the immediate vicinity, at number </w:t>
+      </w:r>
+      <w:r>
+        <w:rPr>
+          <w:b/>
+          <w:bCs/>
+        </w:rPr>
+        <w:t xml:space="preserve">28 of Via </w:t>
+      </w:r>
+      <w:proofErr w:type="spellStart"/>
+      <w:r>
+        <w:rPr>
+          <w:b/>
+          <w:bCs/>
+        </w:rPr>
+        <w:t>Avesella</w:t>
+      </w:r>
+      <w:proofErr w:type="spellEnd"/>
+      <w:r>
+        <w:rPr>
+          <w:b/>
+          <w:bCs/>
+        </w:rPr>
+        <w:t xml:space="preserve"> </w:t>
+      </w:r>
+      <w:r>
+        <w:t xml:space="preserve">, there is another votive shrine which instead depicts </w:t>
+      </w:r>
+      <w:r>
+        <w:rPr>
+          <w:b/>
+          <w:bCs/>
+        </w:rPr>
+        <w:t xml:space="preserve">Saint Anthony with the Child </w:t>
+      </w:r>
+      <w:r>
+        <w:t xml:space="preserve">, a testimony to the richness of this type of popular devotion in the </w:t>
+      </w:r>
+      <w:proofErr w:type="spellStart"/>
+      <w:r>
+        <w:t>neighbourhood</w:t>
+      </w:r>
+      <w:proofErr w:type="spellEnd"/>
+      <w:r>
+        <w:t>.</w:t>
+      </w:r>
+    </w:p>
+    <w:p>
+      <w:pPr>
+        <w:jc w:val="center"/>
+      </w:pPr>
+      <w:r>
+        <w:rPr>
+          <w:noProof/>
+        </w:rPr>
         <w:lastRenderedPageBreak/>
-        <w:t>The small empty niche on the corner seen in the photo is particularly interesting: these cavities often housed very simple terracotta statuettes, known as "Earthquake Madonnas" or protectors of travellers, which were removed or lost over time.</w:t>
-      </w:r>
-    </w:p>
-    <w:p>
-      <w:pPr>
-        <w:rPr>
-          <w:b/>
-          <w:bCs/>
-        </w:rPr>
-      </w:pPr>
-      <w:r>
-        <w:rPr>
-          <w:b/>
-          <w:bCs/>
-        </w:rPr>
-        <w:t>In Avesella there is another votive shrine</w:t>
-      </w:r>
-    </w:p>
-    <w:p>
-      <w:r>
-        <w:t xml:space="preserve">In the immediate vicinity, at number </w:t>
-      </w:r>
-      <w:r>
-        <w:rPr>
-          <w:b/>
-          <w:bCs/>
-        </w:rPr>
-        <w:t xml:space="preserve">28 of Via Avesella </w:t>
-      </w:r>
-      <w:r>
-        <w:t xml:space="preserve">, there is another votive shrine which instead depicts </w:t>
-      </w:r>
-      <w:r>
-        <w:rPr>
-          <w:b/>
-          <w:bCs/>
-        </w:rPr>
-        <w:t xml:space="preserve">Saint Anthony with the Child </w:t>
-      </w:r>
-      <w:r>
-        <w:t>, a testimony to the richness of this type of popular devotion in the neighbourhood.</w:t>
-      </w:r>
-    </w:p>
-    <w:p>
-      <w:pPr>
-        <w:jc w:val="center"/>
-      </w:pPr>
-      <w:r>
-        <w:rPr>
-          <w:noProof/>
-        </w:rPr>
         <w:drawing>
           <wp:inline distT="0" distB="0" distL="0" distR="0" wp14:anchorId="350CF429" wp14:editId="4CFFA308">
             <wp:extent cx="1219200" cy="2564215"/>
@@ -514,7 +769,7 @@
                     <pic:cNvPicPr/>
                   </pic:nvPicPr>
                   <pic:blipFill>
-                    <a:blip r:embed="rId6" cstate="print">
+                    <a:blip r:embed="rId7" cstate="print">
                       <a:extLst>
                         <a:ext uri="{28A0092B-C50C-407E-A947-70E740481C1C}">
                           <a14:useLocalDpi xmlns:a14="http://schemas.microsoft.com/office/drawing/2010/main" val="0"/>
@@ -546,7 +801,15 @@
         <w:jc w:val="center"/>
       </w:pPr>
       <w:r>
-        <w:t>[SPLIT_BLOCK:edicola_san_antonio.jpg]</w:t>
+        <w:t>[</w:t>
+      </w:r>
+      <w:proofErr w:type="spellStart"/>
+      <w:r>
+        <w:t>SPLIT_BLOCK:edicola_san_antonio.jpg</w:t>
+      </w:r>
+      <w:proofErr w:type="spellEnd"/>
+      <w:r>
+        <w:t>]</w:t>
       </w:r>
     </w:p>
     <w:p>

</xml_diff>